<commit_message>
update 11 jul 2026 part 2
</commit_message>
<xml_diff>
--- a/bayanat_Database.docx
+++ b/bayanat_Database.docx
@@ -4325,7 +4325,7 @@
           <w:b w:val="0"/>
           <w:sz w:val="22"/>
         </w:rPr>
-        <w:t>contact_submissions/{submissionId}: {</w:t>
+        <w:t>contactSubmissions/{submissionId}: {</w:t>
       </w:r>
     </w:p>
     <w:p>
@@ -4597,7 +4597,7 @@
           <w:b w:val="0"/>
           <w:sz w:val="22"/>
         </w:rPr>
-        <w:t>blog_posts/{postId}: {</w:t>
+        <w:t>blogPosts/{postId}: {</w:t>
       </w:r>
     </w:p>
     <w:p>
@@ -4843,7 +4843,7 @@
           <w:b w:val="0"/>
           <w:sz w:val="22"/>
         </w:rPr>
-        <w:t>careers_interns/{internId}: {</w:t>
+        <w:t>interns/{internId}: {</w:t>
       </w:r>
     </w:p>
     <w:p>

</xml_diff>

<commit_message>
update 13 jul 2026 part 1
</commit_message>
<xml_diff>
--- a/bayanat_Database.docx
+++ b/bayanat_Database.docx
@@ -905,20 +905,20 @@
           <w:b w:val="0"/>
           <w:sz w:val="22"/>
         </w:rPr>
-        <w:t>aboutPage:{</w:t>
-      </w:r>
-    </w:p>
-    <w:p>
-      <w:pPr>
-        <w:spacing w:after="0" w:before="0"/>
-      </w:pPr>
-      <w:r>
-        <w:rPr>
-          <w:rFonts w:ascii="Cairo" w:hAnsi="Cairo"/>
-          <w:b w:val="0"/>
-          <w:sz w:val="22"/>
-        </w:rPr>
-        <w:t>aboutPage/about_page: {</w:t>
+        <w:t>aboutUs:{</w:t>
+      </w:r>
+    </w:p>
+    <w:p>
+      <w:pPr>
+        <w:spacing w:after="0" w:before="0"/>
+      </w:pPr>
+      <w:r>
+        <w:rPr>
+          <w:rFonts w:ascii="Cairo" w:hAnsi="Cairo"/>
+          <w:b w:val="0"/>
+          <w:sz w:val="22"/>
+        </w:rPr>
+        <w:t>aboutUs/about_page: {</w:t>
       </w:r>
     </w:p>
     <w:p>
@@ -1876,20 +1876,20 @@
           <w:b w:val="0"/>
           <w:sz w:val="22"/>
         </w:rPr>
-        <w:t>servicesPage:{</w:t>
-      </w:r>
-    </w:p>
-    <w:p>
-      <w:pPr>
-        <w:spacing w:after="0" w:before="0"/>
-      </w:pPr>
-      <w:r>
-        <w:rPr>
-          <w:rFonts w:ascii="Cairo" w:hAnsi="Cairo"/>
-          <w:b w:val="0"/>
-          <w:sz w:val="22"/>
-        </w:rPr>
-        <w:t>servicesPage/service_page: {</w:t>
+        <w:t>services:{</w:t>
+      </w:r>
+    </w:p>
+    <w:p>
+      <w:pPr>
+        <w:spacing w:after="0" w:before="0"/>
+      </w:pPr>
+      <w:r>
+        <w:rPr>
+          <w:rFonts w:ascii="Cairo" w:hAnsi="Cairo"/>
+          <w:b w:val="0"/>
+          <w:sz w:val="22"/>
+        </w:rPr>
+        <w:t>services/service_page: {</w:t>
       </w:r>
     </w:p>
     <w:p>
@@ -2614,20 +2614,20 @@
           <w:b w:val="0"/>
           <w:sz w:val="22"/>
         </w:rPr>
-        <w:t>careersSections:{</w:t>
-      </w:r>
-    </w:p>
-    <w:p>
-      <w:pPr>
-        <w:spacing w:after="0" w:before="0"/>
-      </w:pPr>
-      <w:r>
-        <w:rPr>
-          <w:rFonts w:ascii="Cairo" w:hAnsi="Cairo"/>
-          <w:b w:val="0"/>
-          <w:sz w:val="22"/>
-        </w:rPr>
-        <w:t>careersSections/{sectionKey}: {</w:t>
+        <w:t>whyJoinOurTeam:{</w:t>
+      </w:r>
+    </w:p>
+    <w:p>
+      <w:pPr>
+        <w:spacing w:after="0" w:before="0"/>
+      </w:pPr>
+      <w:r>
+        <w:rPr>
+          <w:rFonts w:ascii="Cairo" w:hAnsi="Cairo"/>
+          <w:b w:val="0"/>
+          <w:sz w:val="22"/>
+        </w:rPr>
+        <w:t>whyJoinOurTeam/{sectionKey}: {</w:t>
       </w:r>
     </w:p>
     <w:p>
@@ -2885,20 +2885,20 @@
           <w:b w:val="0"/>
           <w:sz w:val="22"/>
         </w:rPr>
-        <w:t>contactUsPage:{</w:t>
-      </w:r>
-    </w:p>
-    <w:p>
-      <w:pPr>
-        <w:spacing w:after="0" w:before="0"/>
-      </w:pPr>
-      <w:r>
-        <w:rPr>
-          <w:rFonts w:ascii="Cairo" w:hAnsi="Cairo"/>
-          <w:b w:val="0"/>
-          <w:sz w:val="22"/>
-        </w:rPr>
-        <w:t>contactUsPage/main: {</w:t>
+        <w:t>contactUs:{</w:t>
+      </w:r>
+    </w:p>
+    <w:p>
+      <w:pPr>
+        <w:spacing w:after="0" w:before="0"/>
+      </w:pPr>
+      <w:r>
+        <w:rPr>
+          <w:rFonts w:ascii="Cairo" w:hAnsi="Cairo"/>
+          <w:b w:val="0"/>
+          <w:sz w:val="22"/>
+        </w:rPr>
+        <w:t>contactUs/main: {</w:t>
       </w:r>
     </w:p>
     <w:p>

</xml_diff>